<commit_message>
Add Mercadeo y Comunicación area: Elisa + Laura
- New form: discovery/mercadeo-comunicacion/index.html (38 preguntas)
  Cubre: equipo, marca, contenido, redes, comunicación clientes,
  eventos/ferias, web/SEO, PR, métricas, coordinación, dolores
- Landing actualizada con tarjeta #09
- README + email-lanzamiento (.py + .docx) incluyen el área
</commit_message>
<xml_diff>
--- a/Email-Lanzamiento-Discovery-LPT.docx
+++ b/Email-Lanzamiento-Discovery-LPT.docx
@@ -26,7 +26,7 @@
         <w:t xml:space="preserve">Para: </w:t>
       </w:r>
       <w:r>
-        <w:t>martica@..., catherine.monsalve@..., william.nieto@..., jeffrey@..., john.jairo@..., ismelda@..., sergio@..., jhonatan.benavides@...</w:t>
+        <w:t>martica@..., katherine.monsalve@..., william.nieto@..., jeffrey@..., john.jairo@..., ismelda@..., sergio@..., jhonatan.benavides@..., elisa@..., laura@...</w:t>
       </w:r>
     </w:p>
     <w:p>
@@ -232,6 +232,20 @@
           <w:b/>
         </w:rPr>
         <w:t>Tecnología</w:t>
+      </w:r>
+    </w:p>
+    <w:p>
+      <w:pPr>
+        <w:spacing w:after="60"/>
+      </w:pPr>
+      <w:r>
+        <w:t xml:space="preserve">   Elisa + Laura  →  </w:t>
+      </w:r>
+      <w:r>
+        <w:rPr>
+          <w:b/>
+        </w:rPr>
+        <w:t>Mercadeo y Comunicación</w:t>
       </w:r>
     </w:p>
     <w:p/>

</xml_diff>

<commit_message>
Add Administración area: Katherine Rodriguez + Daniela
Identificada por Katherine R. al revisar discovery — área crítica que es
'pegamento' entre contabilidad, tesorería y operaciones. Cubre:
caja menor, cuentas de cobro, compras, proveedores, seguimiento de pagos,
logística, legalización facturas, RH, SGSST.

- Form: discovery/administracion/index.html (41 preguntas)
- Landing card #10
- README + email Word actualizados
- Daniela: nueva persona en el mapa del equipo
</commit_message>
<xml_diff>
--- a/Email-Lanzamiento-Discovery-LPT.docx
+++ b/Email-Lanzamiento-Discovery-LPT.docx
@@ -26,7 +26,7 @@
         <w:t xml:space="preserve">Para: </w:t>
       </w:r>
       <w:r>
-        <w:t>martica@..., katherine.monsalve@..., william.nieto@..., jeffrey@..., john.jairo@..., ismelda@..., sergio@..., jhonatan.benavides@..., elisa@..., laura@...</w:t>
+        <w:t>martica@..., katherine.monsalve@..., william.nieto@..., jeffrey@..., john.jairo@..., ismelda@..., sergio@..., jhonatan.benavides@..., elisa@..., laura@..., katherine.rodriguez@..., daniela@...</w:t>
       </w:r>
     </w:p>
     <w:p>
@@ -246,6 +246,20 @@
           <w:b/>
         </w:rPr>
         <w:t>Mercadeo y Comunicación</w:t>
+      </w:r>
+    </w:p>
+    <w:p>
+      <w:pPr>
+        <w:spacing w:after="60"/>
+      </w:pPr>
+      <w:r>
+        <w:t xml:space="preserve">   Katherine Rodriguez + Daniela  →  </w:t>
+      </w:r>
+      <w:r>
+        <w:rPr>
+          <w:b/>
+        </w:rPr>
+        <w:t>Administración</w:t>
       </w:r>
     </w:p>
     <w:p/>

</xml_diff>